<commit_message>
docs: align docs with ER2cadet + fix DFD Level-1 + status consistency
</commit_message>
<xml_diff>
--- a/report/รายงานโครงงาน-ระบบแจ้งซ่อมอาคารนอน.docx
+++ b/report/รายงานโครงงาน-ระบบแจ้งซ่อมอาคารนอน.docx
@@ -689,7 +689,7 @@
           <w:sz w:val="32"/>
           <w:szCs w:val="32"/>
         </w:rPr>
-        <w:t xml:space="preserve"> ปิดงาน)</w:t>
+        <w:t xml:space="preserve"> ซ่อมเสร็จ)</w:t>
       </w:r>
     </w:p>
     <w:p>
@@ -1526,7 +1526,7 @@
                 <w:sz w:val="32"/>
                 <w:szCs w:val="32"/>
               </w:rPr>
-              <w:t>กำหนดให้ฟิลด์รายการอะไหล่และค่าใช้จ่ายในหน้า Repair_Costs เป็น Required Field ก่อนปิดงาน</w:t>
+              <w:t>กำหนดให้ฟิลด์รายการอะไหล่และค่าใช้จ่ายในหน้า Expense เป็น Required Field ก่อนปิดงาน</w:t>
             </w:r>
           </w:p>
         </w:tc>
@@ -4481,7 +4481,7 @@
                 <w:sz w:val="32"/>
                 <w:szCs w:val="32"/>
               </w:rPr>
-              <w:t>Users</w:t>
+              <w:t>User</w:t>
             </w:r>
           </w:p>
         </w:tc>
@@ -4552,7 +4552,7 @@
                 <w:sz w:val="32"/>
                 <w:szCs w:val="32"/>
               </w:rPr>
-              <w:t>Repair_Requests</w:t>
+              <w:t>RepairRequest</w:t>
             </w:r>
           </w:p>
         </w:tc>
@@ -4623,7 +4623,7 @@
                 <w:sz w:val="32"/>
                 <w:szCs w:val="32"/>
               </w:rPr>
-              <w:t>Repair_Assignments</w:t>
+              <w:t>Repair</w:t>
             </w:r>
           </w:p>
         </w:tc>
@@ -4694,7 +4694,7 @@
                 <w:sz w:val="32"/>
                 <w:szCs w:val="32"/>
               </w:rPr>
-              <w:t>Repair_Costs</w:t>
+              <w:t>Expense</w:t>
             </w:r>
           </w:p>
         </w:tc>
@@ -4869,7 +4869,7 @@
           <w:sz w:val="32"/>
           <w:szCs w:val="32"/>
         </w:rPr>
-        <w:t xml:space="preserve"> Save to Repair_Requests</w:t>
+        <w:t xml:space="preserve"> Save to RepairRequest</w:t>
       </w:r>
     </w:p>
     <w:p>
@@ -4935,7 +4935,7 @@
           <w:sz w:val="32"/>
           <w:szCs w:val="32"/>
         </w:rPr>
-        <w:t xml:space="preserve"> Update Status = 'Closed' </w:t>
+        <w:t xml:space="preserve"> Update Status = 'Completed' </w:t>
       </w:r>
       <w:r>
         <w:rPr>
@@ -4951,7 +4951,7 @@
           <w:sz w:val="32"/>
           <w:szCs w:val="32"/>
         </w:rPr>
-        <w:t xml:space="preserve"> Save to Repair_Costs</w:t>
+        <w:t xml:space="preserve"> Save to Expense</w:t>
       </w:r>
     </w:p>
     <w:p>
@@ -4985,10 +4985,10 @@
           <w:sz w:val="32"/>
           <w:szCs w:val="32"/>
         </w:rPr>
-        <w:t>แสดงโครงสร้างความสัมพันธ์ 4 ตารางหลัก:</w:t>
+        <w:t>แสดงโครงสร้างความสัมพันธ์ของเอนทิตี้หลัก (8 เอนทิตี้ ตาม ER2cadet.xml):</w:t>
       </w:r>
     </w:p>
-    <w:p>
+    <w:p w14:paraId="NA1141437012">
       <w:pPr>
         <w:ind w:left="425"/>
         <w:rPr>
@@ -5003,14 +5003,10 @@
           <w:sz w:val="32"/>
           <w:szCs w:val="32"/>
         </w:rPr>
-        <w:t xml:space="preserve">Users (1) </w:t>
+        <w:t xml:space="preserve">User (1) </w:t>
       </w:r>
       <w:r>
-        <w:rPr>
-          <w:rFonts w:ascii="Arial" w:hAnsi="Arial" w:cs="Arial"/>
-          <w:sz w:val="32"/>
-          <w:szCs w:val="32"/>
-        </w:rPr>
+        User (1) 
         <w:t>→</w:t>
       </w:r>
       <w:r>
@@ -5019,10 +5015,18 @@
           <w:sz w:val="32"/>
           <w:szCs w:val="32"/>
         </w:rPr>
-        <w:t xml:space="preserve"> (N) Repair_Requests (นักเรียน 1 คน แจ้งได้หลายคำขอ)</w:t>
+        <w:t xml:space="preserve"> (N) RepairRequest</w:t>
+      </w:r>
+      <w:r>
+        <w:rPr>
+          <w:rFonts w:ascii="TH Sarabun New" w:hAnsi="TH Sarabun New" w:cs="TH Sarabun New"/>
+          <w:sz w:val="32"/>
+          <w:szCs w:val="32"/>
+        </w:rPr>
+        <w:t xml:space="preserve"> (ผู้ใช้ 1 คน สร้างคำขอแจ้งซ่อมได้หลายรายการ)</w:t>
       </w:r>
     </w:p>
-    <w:p>
+    <w:p w14:paraId="NA301110229">
       <w:pPr>
         <w:ind w:left="425"/>
         <w:rPr>
@@ -5037,14 +5041,10 @@
           <w:sz w:val="32"/>
           <w:szCs w:val="32"/>
         </w:rPr>
-        <w:t xml:space="preserve">Repair_Requests (1) </w:t>
+        <w:t xml:space="preserve">Building (1) </w:t>
       </w:r>
       <w:r>
-        <w:rPr>
-          <w:rFonts w:ascii="Arial" w:hAnsi="Arial" w:cs="Arial"/>
-          <w:sz w:val="32"/>
-          <w:szCs w:val="32"/>
-        </w:rPr>
+        Building (1) 
         <w:t>→</w:t>
       </w:r>
       <w:r>
@@ -5053,10 +5053,18 @@
           <w:sz w:val="32"/>
           <w:szCs w:val="32"/>
         </w:rPr>
-        <w:t xml:space="preserve"> (1) Repair_Assignments (1 คำขอ มีการมอบหมาย 1 ครั้ง)</w:t>
+        <w:t xml:space="preserve"> (N) Room</w:t>
+      </w:r>
+      <w:r>
+        <w:rPr>
+          <w:rFonts w:ascii="TH Sarabun New" w:hAnsi="TH Sarabun New" w:cs="TH Sarabun New"/>
+          <w:sz w:val="32"/>
+          <w:szCs w:val="32"/>
+        </w:rPr>
+        <w:t xml:space="preserve"> (อาคาร 1 หลัง ประกอบด้วยหลายห้อง)</w:t>
       </w:r>
     </w:p>
-    <w:p>
+    <w:p w14:paraId="NA287111661">
       <w:pPr>
         <w:ind w:left="425"/>
         <w:rPr>
@@ -5071,14 +5079,10 @@
           <w:sz w:val="32"/>
           <w:szCs w:val="32"/>
         </w:rPr>
-        <w:t xml:space="preserve">Repair_Assignments (1) </w:t>
+        <w:t xml:space="preserve">Room (1) </w:t>
       </w:r>
       <w:r>
-        <w:rPr>
-          <w:rFonts w:ascii="Arial" w:hAnsi="Arial" w:cs="Arial"/>
-          <w:sz w:val="32"/>
-          <w:szCs w:val="32"/>
-        </w:rPr>
+        Room (1) 
         <w:t>→</w:t>
       </w:r>
       <w:r>
@@ -5087,7 +5091,167 @@
           <w:sz w:val="32"/>
           <w:szCs w:val="32"/>
         </w:rPr>
-        <w:t xml:space="preserve"> (1) Repair_Costs (1 งานซ่อม มีการลงบันทึกค่าใช้จ่าย 1 ชุด)</w:t>
+        <w:t xml:space="preserve"> (N) RepairRequest</w:t>
+      </w:r>
+      <w:r>
+        <w:rPr>
+          <w:rFonts w:ascii="TH Sarabun New" w:hAnsi="TH Sarabun New" w:cs="TH Sarabun New"/>
+          <w:sz w:val="32"/>
+          <w:szCs w:val="32"/>
+        </w:rPr>
+        <w:t xml:space="preserve"> (ห้อง 1 ห้อง เกิดการแจ้งซ่อมได้หลายครั้ง)</w:t>
+      </w:r>
+    </w:p>
+    <w:p w14:paraId="NA1291591065">
+      <w:pPr>
+        <w:ind w:left="425"/>
+        <w:rPr>
+          <w:rFonts w:ascii="TH Sarabun New" w:hAnsi="TH Sarabun New" w:cs="TH Sarabun New"/>
+          <w:sz w:val="32"/>
+          <w:szCs w:val="32"/>
+        </w:rPr>
+      </w:pPr>
+      <w:r>
+        <w:rPr>
+          <w:rFonts w:ascii="TH Sarabun New" w:hAnsi="TH Sarabun New" w:cs="TH Sarabun New"/>
+          <w:sz w:val="32"/>
+          <w:szCs w:val="32"/>
+        </w:rPr>
+        <w:t xml:space="preserve">Status (1) </w:t>
+      </w:r>
+      <w:r>
+        Status (1) 
+        <w:t>→</w:t>
+      </w:r>
+      <w:r>
+        <w:rPr>
+          <w:rFonts w:ascii="TH Sarabun New" w:hAnsi="TH Sarabun New" w:cs="TH Sarabun New"/>
+          <w:sz w:val="32"/>
+          <w:szCs w:val="32"/>
+        </w:rPr>
+        <w:t xml:space="preserve"> (N) RepairRequest</w:t>
+      </w:r>
+      <w:r>
+        <w:rPr>
+          <w:rFonts w:ascii="TH Sarabun New" w:hAnsi="TH Sarabun New" w:cs="TH Sarabun New"/>
+          <w:sz w:val="32"/>
+          <w:szCs w:val="32"/>
+        </w:rPr>
+        <w:t xml:space="preserve"> (สถานะ 1 สถานะ ใช้กับคำขอแจ้งซ่อมได้หลายรายการ)</w:t>
+      </w:r>
+    </w:p>
+    <w:p w14:paraId="NA1805707350">
+      <w:pPr>
+        <w:ind w:left="425"/>
+        <w:rPr>
+          <w:rFonts w:ascii="TH Sarabun New" w:hAnsi="TH Sarabun New" w:cs="TH Sarabun New"/>
+          <w:sz w:val="32"/>
+          <w:szCs w:val="32"/>
+        </w:rPr>
+      </w:pPr>
+      <w:r>
+        <w:rPr>
+          <w:rFonts w:ascii="TH Sarabun New" w:hAnsi="TH Sarabun New" w:cs="TH Sarabun New"/>
+          <w:sz w:val="32"/>
+          <w:szCs w:val="32"/>
+        </w:rPr>
+        <w:t xml:space="preserve">RepairRequest (1) </w:t>
+      </w:r>
+      <w:r>
+        RepairRequest (1) 
+        <w:t>→</w:t>
+      </w:r>
+      <w:r>
+        <w:rPr>
+          <w:rFonts w:ascii="TH Sarabun New" w:hAnsi="TH Sarabun New" w:cs="TH Sarabun New"/>
+          <w:sz w:val="32"/>
+          <w:szCs w:val="32"/>
+        </w:rPr>
+        <w:t xml:space="preserve"> (1) Repair</w:t>
+      </w:r>
+      <w:r>
+        <w:rPr>
+          <w:rFonts w:ascii="TH Sarabun New" w:hAnsi="TH Sarabun New" w:cs="TH Sarabun New"/>
+          <w:sz w:val="32"/>
+          <w:szCs w:val="32"/>
+        </w:rPr>
+        <w:t xml:space="preserve"> (1 คำขอ ถูกดำเนินการซ่อม 1 งาน)</w:t>
+      </w:r>
+    </w:p>
+    <w:p w14:paraId="NA17946473">
+      <w:pPr>
+        <w:ind w:left="425"/>
+        <w:rPr>
+          <w:rFonts w:ascii="TH Sarabun New" w:hAnsi="TH Sarabun New" w:cs="TH Sarabun New"/>
+          <w:sz w:val="32"/>
+          <w:szCs w:val="32"/>
+        </w:rPr>
+      </w:pPr>
+      <w:r>
+        <w:rPr>
+          <w:rFonts w:ascii="TH Sarabun New" w:hAnsi="TH Sarabun New" w:cs="TH Sarabun New"/>
+          <w:sz w:val="32"/>
+          <w:szCs w:val="32"/>
+        </w:rPr>
+        <w:t xml:space="preserve">Technician (1) </w:t>
+      </w:r>
+      <w:r>
+        Technician (1) 
+        <w:t>→</w:t>
+      </w:r>
+      <w:r>
+        <w:rPr>
+          <w:rFonts w:ascii="TH Sarabun New" w:hAnsi="TH Sarabun New" w:cs="TH Sarabun New"/>
+          <w:sz w:val="32"/>
+          <w:szCs w:val="32"/>
+        </w:rPr>
+        <w:t xml:space="preserve"> (N) Repair</w:t>
+      </w:r>
+      <w:r>
+        <w:rPr>
+          <w:rFonts w:ascii="TH Sarabun New" w:hAnsi="TH Sarabun New" w:cs="TH Sarabun New"/>
+          <w:sz w:val="32"/>
+          <w:szCs w:val="32"/>
+        </w:rPr>
+        <w:t xml:space="preserve"> (ช่าง 1 คน รับผิดชอบงานซ่อมได้หลายงาน)</w:t>
+      </w:r>
+    </w:p>
+    <w:p w14:paraId="NA990433560">
+      <w:pPr>
+        <w:ind w:left="425"/>
+        <w:rPr>
+          <w:rFonts w:ascii="TH Sarabun New" w:hAnsi="TH Sarabun New" w:cs="TH Sarabun New"/>
+          <w:sz w:val="32"/>
+          <w:szCs w:val="32"/>
+        </w:rPr>
+      </w:pPr>
+      <w:r>
+        <w:rPr>
+          <w:rFonts w:ascii="TH Sarabun New" w:hAnsi="TH Sarabun New" w:cs="TH Sarabun New"/>
+          <w:sz w:val="32"/>
+          <w:szCs w:val="32"/>
+        </w:rPr>
+        <w:t xml:space="preserve">Repair (1) </w:t>
+      </w:r>
+      <w:r>
+        Repair (1) 
+        <w:t>→</w:t>
+      </w:r>
+      <w:r>
+        <w:rPr>
+          <w:rFonts w:ascii="TH Sarabun New" w:hAnsi="TH Sarabun New" w:cs="TH Sarabun New"/>
+          <w:sz w:val="32"/>
+          <w:szCs w:val="32"/>
+        </w:rPr>
+        <w:t xml:space="preserve"> (N) Expense</w:t>
+      </w:r>
+      <w:r>
+        <w:rPr>
+          <w:rFonts w:ascii="TH Sarabun New" w:hAnsi="TH Sarabun New" w:cs="TH Sarabun New"/>
+          <w:sz w:val="32"/>
+          <w:szCs w:val="32"/>
+        </w:rPr>
+        <w:t xml:space="preserve"> (งานซ่อม 1 งาน มีค่าใช้จ่ายได้หลายรายการ)</w:t>
       </w:r>
     </w:p>
     <w:p>
@@ -5139,7 +5303,7 @@
           <w:sz w:val="32"/>
           <w:szCs w:val="32"/>
         </w:rPr>
-        <w:t>1. Table: Users (user_id [PK, INT], username [VARCHAR], password [VARCHAR], full_name [VARCHAR], role [ENUM: Cadet, Admin, Tech, Exec])</w:t>
+        <w:t>1. Table: User (user_id [PK, INT], name [VARCHAR], rank [VARCHAR], email [VARCHAR], username [VARCHAR], password [VARCHAR], role [ENUM: Cadet, Admin, Tech, Exec])</w:t>
       </w:r>
     </w:p>
     <w:p>
@@ -5157,7 +5321,7 @@
           <w:sz w:val="32"/>
           <w:szCs w:val="32"/>
         </w:rPr>
-        <w:t>2. Table: Repair_Requests (request_id [PK, VARCHAR], user_id [FK, INT], building [VARCHAR], room [VARCHAR], problem_type [VARCHAR], status [VARCHAR])</w:t>
+        <w:t>2. Table: Building (building_id [PK, INT], building_name [VARCHAR], description [TEXT])</w:t>
       </w:r>
     </w:p>
     <w:p>
@@ -5175,8 +5339,7 @@
           <w:sz w:val="32"/>
           <w:szCs w:val="32"/>
         </w:rPr>
-        <w:lastRenderedPageBreak/>
-        <w:t>3. Table: Repair_Assignments (assignment_id [PK, INT], request_id [FK, VARCHAR], tech_id [FK, INT], assign_date [DATETIME])</w:t>
+        <w:t>3. Table: Room (room_id [PK, INT], building_id [FK, INT], floor [INT], room_number [VARCHAR])</w:t>
       </w:r>
     </w:p>
     <w:p>
@@ -5194,7 +5357,79 @@
           <w:sz w:val="32"/>
           <w:szCs w:val="32"/>
         </w:rPr>
-        <w:t>4. Table: Repair_Costs (cost_id [PK, INT], assignment_id [FK, INT], part_name [VARCHAR], part_cost [DECIMAL], total_cost [DECIMAL])</w:t>
+        <w:t>4. Table: RepairRequest (request_id [PK, VARCHAR], user_id [FK, INT], room_id [FK, INT], status_id [FK, INT], problem_type [VARCHAR], description [TEXT], image [VARCHAR], urgency [VARCHAR], request_date [DATETIME])</w:t>
+      </w:r>
+    </w:p>
+    <w:p>
+      <w:pPr>
+        <w:ind w:left="283"/>
+        <w:rPr>
+          <w:rFonts w:ascii="TH Sarabun New" w:hAnsi="TH Sarabun New" w:cs="TH Sarabun New"/>
+          <w:sz w:val="32"/>
+          <w:szCs w:val="32"/>
+        </w:rPr>
+      </w:pPr>
+      <w:r>
+        <w:rPr>
+          <w:rFonts w:ascii="TH Sarabun New" w:hAnsi="TH Sarabun New" w:cs="TH Sarabun New"/>
+          <w:sz w:val="32"/>
+          <w:szCs w:val="32"/>
+        </w:rPr>
+        <w:t>5. Table: Status (status_id [PK, INT], status_name [VARCHAR], description [TEXT])</w:t>
+      </w:r>
+    </w:p>
+    <w:p>
+      <w:pPr>
+        <w:ind w:left="283"/>
+        <w:rPr>
+          <w:rFonts w:ascii="TH Sarabun New" w:hAnsi="TH Sarabun New" w:cs="TH Sarabun New"/>
+          <w:sz w:val="32"/>
+          <w:szCs w:val="32"/>
+        </w:rPr>
+      </w:pPr>
+      <w:r>
+        <w:rPr>
+          <w:rFonts w:ascii="TH Sarabun New" w:hAnsi="TH Sarabun New" w:cs="TH Sarabun New"/>
+          <w:sz w:val="32"/>
+          <w:szCs w:val="32"/>
+        </w:rPr>
+        <w:t>6. Table: Technician (tech_id [PK, INT], name [VARCHAR], specialty [VARCHAR], phone [VARCHAR])</w:t>
+      </w:r>
+    </w:p>
+    <w:p>
+      <w:pPr>
+        <w:ind w:left="283"/>
+        <w:rPr>
+          <w:rFonts w:ascii="TH Sarabun New" w:hAnsi="TH Sarabun New" w:cs="TH Sarabun New"/>
+          <w:sz w:val="32"/>
+          <w:szCs w:val="32"/>
+        </w:rPr>
+      </w:pPr>
+      <w:r>
+        <w:rPr>
+          <w:rFonts w:ascii="TH Sarabun New" w:hAnsi="TH Sarabun New" w:cs="TH Sarabun New"/>
+          <w:sz w:val="32"/>
+          <w:szCs w:val="32"/>
+        </w:rPr>
+        <w:t>7. Table: Repair (repair_id [PK, INT], request_id [FK, VARCHAR], tech_id [FK, INT], repair_detail [TEXT], repair_date [DATETIME], completion_date [DATETIME], repair_result [VARCHAR])</w:t>
+      </w:r>
+    </w:p>
+    <w:p>
+      <w:pPr>
+        <w:ind w:left="283"/>
+        <w:rPr>
+          <w:rFonts w:ascii="TH Sarabun New" w:hAnsi="TH Sarabun New" w:cs="TH Sarabun New"/>
+          <w:sz w:val="32"/>
+          <w:szCs w:val="32"/>
+        </w:rPr>
+      </w:pPr>
+      <w:r>
+        <w:rPr>
+          <w:rFonts w:ascii="TH Sarabun New" w:hAnsi="TH Sarabun New" w:cs="TH Sarabun New"/>
+          <w:sz w:val="32"/>
+          <w:szCs w:val="32"/>
+        </w:rPr>
+        <w:t>8. Table: Expense (expense_id [PK, INT], repair_id [FK, INT], item_name [VARCHAR], quantity [INT], unit_price [DECIMAL], labor_cost [DECIMAL], other_cost [DECIMAL])</w:t>
       </w:r>
     </w:p>
     <w:p>
@@ -6407,7 +6642,7 @@
                 <w:sz w:val="32"/>
                 <w:szCs w:val="32"/>
               </w:rPr>
-              <w:t>สถานะเปลี่ยนเป็น กำลังซ่อม และสร้าง Assignment Record</w:t>
+              <w:t>สร้าง Assignment Record และแจ้งเตือนช่าง (สถานะ: รับเรื่อง รอช่างเริ่มดำเนินการ)</w:t>
             </w:r>
           </w:p>
         </w:tc>
@@ -6500,7 +6735,7 @@
                 <w:sz w:val="32"/>
                 <w:szCs w:val="32"/>
               </w:rPr>
-              <w:t>คำนวณยอดรวม 120 บาท บันทึกลง Repair_Costs และเปลี่ยนสถานะเป็น ปิดงาน</w:t>
+              <w:t>คำนวณยอดรวม 120 บาท บันทึกลง Expense และเปลี่ยนสถานะเป็น ซ่อมเสร็จ</w:t>
             </w:r>
           </w:p>
         </w:tc>
@@ -6773,7 +7008,7 @@
                 <w:sz w:val="32"/>
                 <w:szCs w:val="32"/>
               </w:rPr>
-              <w:t>รัน SQL Script สร้าง 4 ตารางหลัก (Users, Repair_Requests, Repair_Assignments, Repair_Costs)</w:t>
+              <w:t>รัน SQL Script สร้าง 8 ตารางหลัก (User, Building, Room, RepairRequest, Status, Technician, Repair, Expense)</w:t>
             </w:r>
           </w:p>
         </w:tc>

</xml_diff>

<commit_message>
docs: align report and prototype terminology
</commit_message>
<xml_diff>
--- a/report/รายงานโครงงาน-ระบบแจ้งซ่อมอาคารนอน.docx
+++ b/report/รายงานโครงงาน-ระบบแจ้งซ่อมอาคารนอน.docx
@@ -5393,7 +5393,7 @@
           <w:sz w:val="32"/>
           <w:szCs w:val="32"/>
         </w:rPr>
-        <w:t>6. Table: Technician (tech_id [PK, INT], name [VARCHAR], specialty [VARCHAR], phone [VARCHAR])</w:t>
+        <w:t>6. Table: Technician (technician_id [PK, INT], name [VARCHAR], specialty [VARCHAR], phone [VARCHAR])</w:t>
       </w:r>
     </w:p>
     <w:p>
@@ -5411,7 +5411,7 @@
           <w:sz w:val="32"/>
           <w:szCs w:val="32"/>
         </w:rPr>
-        <w:t>7. Table: Repair (repair_id [PK, INT], request_id [FK, VARCHAR], tech_id [FK, INT], repair_detail [TEXT], repair_date [DATETIME], completion_date [DATETIME], repair_result [VARCHAR])</w:t>
+        <w:t>7. Table: Repair (repair_id [PK, INT], request_id [FK, VARCHAR], technician_id [FK, INT], repair_detail [TEXT], repair_date [DATETIME], completion_date [DATETIME], repair_result [TEXT])</w:t>
       </w:r>
     </w:p>
     <w:p>

</xml_diff>